<commit_message>
Remove Sanity record counts from deck and document
Replace specific document counts with the quote's wording (roughly
24,800+ documents to migrate) and rework the quota slide so it no
longer relies on record counts.

Co-Authored-By: Claude Sonnet 5.5 <noreply@anthropic.com>
Claude-Session: https://claude.ai/code/session_01KJtFxuEaUDPzkEMnDgLJHH
</commit_message>
<xml_diff>
--- a/quotes/2026-09-15-sanity-to-mongodb-migration/CaterFlow-MongoDB-Migration-Options-Considerations-Pricing.docx
+++ b/quotes/2026-09-15-sanity-to-mongodb-migration/CaterFlow-MongoDB-Migration-Options-Considerations-Pricing.docx
@@ -210,7 +210,7 @@
               <w:rPr>
                 <w:sz w:val="19"/>
               </w:rPr>
-              <w:t xml:space="preserve">Production was blocked at about 31,059 live Sanity documents, and archive-and-delete cannot shrink the live count below one 60-day window of new documents, so any feature that stores new records in Sanity raises that floor</w:t>
+              <w:t xml:space="preserve">Production was blocked by Sanity’s document quota, and archive-and-delete cannot shrink the live count below one 60-day window of new documents, so any feature that stores new records in Sanity raises that floor</w:t>
             </w:r>
           </w:p>
         </w:tc>
@@ -428,7 +428,7 @@
         <w:pStyle w:val="FirstParagraph"/>
       </w:pPr>
       <w:r>
-        <w:t xml:space="preserve">The retention report (22 September 2026) found the production app blocked by Sanity’s document quota at about 31,059 live documents. The assumed 50,000-document Growth tier was contradicted, so the real limit is still unconfirmed.</w:t>
+        <w:t xml:space="preserve">The retention report (22 September 2026) found the production app blocked by Sanity’s document quota. The assumed document-limit tier was contradicted, so the real limit is still unconfirmed.</w:t>
       </w:r>
     </w:p>
     <w:p>
@@ -436,7 +436,7 @@
         <w:pStyle w:val="BodyText"/>
       </w:pPr>
       <w:r>
-        <w:t xml:space="preserve">The archive-and-delete pipeline is the workaround. It copies documents older than 60 days into MongoDB and deletes them from Sanity. The report found it had effectively never worked: the deletion step checked the archive date instead of the business date, so only 586 documents were deletable when 11,943 should have been.</w:t>
+        <w:t xml:space="preserve">The archive-and-delete pipeline is the workaround. It copies documents older than 60 days into MongoDB and deletes them from Sanity. The report found it had effectively never worked: the deletion step checked the archive date instead of the business date, so only a small fraction of the documents that should have been deletable were.</w:t>
       </w:r>
     </w:p>
     <w:p>
@@ -489,7 +489,7 @@
         <w:pStyle w:val="Compact"/>
       </w:pPr>
       <w:r>
-        <w:t xml:space="preserve">Master data: 601 stock items, 34 users, 18 bins, 17 suppliers, 16 categories and 8 sites.</w:t>
+        <w:t xml:space="preserve">Master data: stock items, users, bins, suppliers, categories and sites.</w:t>
       </w:r>
     </w:p>
     <w:p>
@@ -1239,13 +1239,13 @@
           <w:bCs/>
           <w:b/>
         </w:rPr>
-        <w:t xml:space="preserve">About 24,784 documents</w:t>
-      </w:r>
-      <w:r>
-        <w:t xml:space="preserve"> </w:t>
-      </w:r>
-      <w:r>
-        <w:t xml:space="preserve">in the latest production export (601 stock items, 34 users, 18 bins, 17 suppliers, 16 categories, 8 sites, plus thousands of nested transaction records) are migrated with IDs and references remapped.</w:t>
+        <w:t xml:space="preserve">Roughly 24,800+ documents</w:t>
+      </w:r>
+      <w:r>
+        <w:t xml:space="preserve"> </w:t>
+      </w:r>
+      <w:r>
+        <w:t xml:space="preserve">in the production data (stock items, users, bins, suppliers, categories, sites and thousands of nested transaction records) are migrated with IDs and references remapped.</w:t>
       </w:r>
     </w:p>
     <w:p>
@@ -1433,7 +1433,7 @@
               <w:rPr>
                 <w:sz w:val="19"/>
               </w:rPr>
-              <w:t xml:space="preserve">Row counts and references match the 24,784-document export</w:t>
+              <w:t xml:space="preserve">Row counts and references match the production export</w:t>
             </w:r>
           </w:p>
         </w:tc>
@@ -3636,7 +3636,7 @@
               <w:rPr>
                 <w:sz w:val="19"/>
               </w:rPr>
-              <w:t xml:space="preserve">Production was blocked at about 31,059 live documents; the deletion fix is not yet deployed</w:t>
+              <w:t xml:space="preserve">Production was blocked by the document quota; the deletion fix is not yet deployed</w:t>
             </w:r>
           </w:p>
         </w:tc>
@@ -3651,7 +3651,7 @@
               <w:rPr>
                 <w:sz w:val="19"/>
               </w:rPr>
-              <w:t xml:space="preserve">Take a fresh backup, deploy the fix, then run one archive pass and one delete pass and check the counts. The next cleanup will try to delete about 11,900 documents in one pass</w:t>
+              <w:t xml:space="preserve">Take a fresh backup, deploy the fix, then run one archive pass and one delete pass and check the counts. The next cleanup will try to delete a very large batch of documents in one pass</w:t>
             </w:r>
           </w:p>
         </w:tc>
@@ -3687,7 +3687,7 @@
               <w:rPr>
                 <w:sz w:val="19"/>
               </w:rPr>
-              <w:t xml:space="preserve">The assumed 50,000-document tier was contradicted</w:t>
+              <w:t xml:space="preserve">The assumed document-limit tier was contradicted</w:t>
             </w:r>
           </w:p>
         </w:tc>

</xml_diff>

<commit_message>
Docs: reference the 25,000-document Sanity limit in the MongoDB migration documents
- Migration plan: add the confirmed 25,000-document limit; the June export
  (~24,784) is ~99% of it.
- Word document and deck: state the 25,000 limit and replace "quota and tier
  unknown" with "price unconfirmed (limit confirmed at 25,000)"; no record
  counts reintroduced.
- analysis.md and accuracy plan: use the June count (~99%) instead of the
  March count (~50%) for headroom.

Co-Authored-By: Claude Sonnet 5.5 <noreply@anthropic.com>
Claude-Session: https://claude.ai/code/session_01KJtFxuEaUDPzkEMnDgLJHH
</commit_message>
<xml_diff>
--- a/quotes/2026-09-15-sanity-to-mongodb-migration/CaterFlow-MongoDB-Migration-Options-Considerations-Pricing.docx
+++ b/quotes/2026-09-15-sanity-to-mongodb-migration/CaterFlow-MongoDB-Migration-Options-Considerations-Pricing.docx
@@ -118,7 +118,7 @@
         <w:pStyle w:val="FirstParagraph"/>
       </w:pPr>
       <w:r>
-        <w:t xml:space="preserve">Moving CaterFlow’s live data from Sanity to MongoDB removes a document ceiling that every new feature pushes toward, and it ends the two-database split behind the stock and Reports errors. The quoted fixed fee is SZL 20,000 for 96–139 estimated hours.</w:t>
+        <w:t>Moving CaterFlow’s live data from Sanity to MongoDB removes the 25,000-document Sanity ceiling that every new feature pushes toward, and it ends the two-database split behind the stock and Reports errors. The quoted fixed fee is SZL 20,000 for 96–139 estimated hours.</w:t>
       </w:r>
     </w:p>
     <w:tbl>
@@ -210,7 +210,7 @@
               <w:rPr>
                 <w:sz w:val="19"/>
               </w:rPr>
-              <w:t xml:space="preserve">Production was blocked by Sanity’s document quota, and archive-and-delete cannot shrink the live count below one 60-day window of new documents, so any feature that stores new records in Sanity raises that floor</w:t>
+              <w:t>Production was blocked by Sanity’s 25,000-document quota, and archive-and-delete cannot shrink the live count below one 60-day window of new documents, so any feature that stores new records in Sanity raises that floor</w:t>
             </w:r>
           </w:p>
         </w:tc>
@@ -428,7 +428,7 @@
         <w:pStyle w:val="FirstParagraph"/>
       </w:pPr>
       <w:r>
-        <w:t xml:space="preserve">The retention report (22 September 2026) found the production app blocked by Sanity’s document quota. The assumed document-limit tier was contradicted, so the real limit is still unconfirmed.</w:t>
+        <w:t>The retention report (22 September 2026) found the production app blocked by Sanity’s document quota. CaterFlow’s Sanity plan allows 25,000 documents. The report’s assumed document-limit tier was contradicted; the 25,000 limit has since been confirmed.</w:t>
       </w:r>
     </w:p>
     <w:p>
@@ -3670,7 +3670,7 @@
               <w:rPr>
                 <w:sz w:val="19"/>
               </w:rPr>
-              <w:t xml:space="preserve">Sanity quota and tier unknown</w:t>
+              <w:t>Sanity price unconfirmed (limit is 25,000)</w:t>
             </w:r>
           </w:p>
         </w:tc>
@@ -3687,7 +3687,7 @@
               <w:rPr>
                 <w:sz w:val="19"/>
               </w:rPr>
-              <w:t xml:space="preserve">The assumed document-limit tier was contradicted</w:t>
+              <w:t>The document limit is confirmed at 25,000; the plan price has not been checked against the billing page</w:t>
             </w:r>
           </w:p>
         </w:tc>
@@ -3704,7 +3704,7 @@
               <w:rPr>
                 <w:sz w:val="19"/>
               </w:rPr>
-              <w:t xml:space="preserve">Confirm the plan, limit and price on the Sanity billing page</w:t>
+              <w:t>Confirm the plan price on the Sanity billing page and track the live document count against the 25,000 limit</w:t>
             </w:r>
           </w:p>
         </w:tc>

</xml_diff>